<commit_message>
Complete final project document
</commit_message>
<xml_diff>
--- a/bao_cao/Nhom23_Bao_cao.docx
+++ b/bao_cao/Nhom23_Bao_cao.docx
@@ -1,6 +1,6 @@
 
 <file path=word/document.xml><?xml version="1.0" encoding="utf-8"?>
-<w:document xmlns:wpc="http://schemas.microsoft.com/office/word/2010/wordprocessingCanvas" xmlns:cx="http://schemas.microsoft.com/office/drawing/2014/chartex" xmlns:cx1="http://schemas.microsoft.com/office/drawing/2015/9/8/chartex" xmlns:cx2="http://schemas.microsoft.com/office/drawing/2015/10/21/chartex" xmlns:cx3="http://schemas.microsoft.com/office/drawing/2016/5/9/chartex" xmlns:cx4="http://schemas.microsoft.com/office/drawing/2016/5/10/chartex" xmlns:cx5="http://schemas.microsoft.com/office/drawing/2016/5/11/chartex" xmlns:cx6="http://schemas.microsoft.com/office/drawing/2016/5/12/chartex" xmlns:cx7="http://schemas.microsoft.com/office/drawing/2016/5/13/chartex" xmlns:cx8="http://schemas.microsoft.com/office/drawing/2016/5/14/chartex" xmlns:mc="http://schemas.openxmlformats.org/markup-compatibility/2006" xmlns:aink="http://schemas.microsoft.com/office/drawing/2016/ink" xmlns:am3d="http://schemas.microsoft.com/office/drawing/2017/model3d" xmlns:o="urn:schemas-microsoft-com:office:office" xmlns:oel="http://schemas.microsoft.com/office/2019/extlst" xmlns:r="http://schemas.openxmlformats.org/officeDocument/2006/relationships" xmlns:m="http://schemas.openxmlformats.org/officeDocument/2006/math" xmlns:v="urn:schemas-microsoft-com:vml" xmlns:wp14="http://schemas.microsoft.com/office/word/2010/wordprocessingDrawing" xmlns:wp="http://schemas.openxmlformats.org/drawingml/2006/wordprocessingDrawing" xmlns:w10="urn:schemas-microsoft-com:office:word" xmlns:w="http://schemas.openxmlformats.org/wordprocessingml/2006/main" xmlns:w14="http://schemas.microsoft.com/office/word/2010/wordml" xmlns:w15="http://schemas.microsoft.com/office/word/2012/wordml" xmlns:w16cex="http://schemas.microsoft.com/office/word/2018/wordml/cex" xmlns:w16cid="http://schemas.microsoft.com/office/word/2016/wordml/cid" xmlns:w16="http://schemas.microsoft.com/office/word/2018/wordml" xmlns:w16du="http://schemas.microsoft.com/office/word/2023/wordml/word16du" xmlns:w16sdtdh="http://schemas.microsoft.com/office/word/2020/wordml/sdtdatahash" xmlns:w16sdtfl="http://schemas.microsoft.com/office/word/2024/wordml/sdtformatlock" xmlns:w16se="http://schemas.microsoft.com/office/word/2015/wordml/symex" xmlns:wpg="http://schemas.microsoft.com/office/word/2010/wordprocessingGroup" xmlns:wpi="http://schemas.microsoft.com/office/word/2010/wordprocessingInk" xmlns:wne="http://schemas.microsoft.com/office/word/2006/wordml" xmlns:wps="http://schemas.microsoft.com/office/word/2010/wordprocessingShape" mc:Ignorable="w14 w15 w16se w16cid w16 w16cex w16sdtdh w16sdtfl w16du wp14">
+<w:document xmlns:wpc="http://schemas.microsoft.com/office/word/2010/wordprocessingCanvas" xmlns:cx="http://schemas.microsoft.com/office/drawing/2014/chartex" xmlns:cx1="http://schemas.microsoft.com/office/drawing/2015/9/8/chartex" xmlns:cx2="http://schemas.microsoft.com/office/drawing/2015/10/21/chartex" xmlns:cx3="http://schemas.microsoft.com/office/drawing/2016/5/9/chartex" xmlns:cx4="http://schemas.microsoft.com/office/drawing/2016/5/10/chartex" xmlns:cx5="http://schemas.microsoft.com/office/drawing/2016/5/11/chartex" xmlns:cx6="http://schemas.microsoft.com/office/drawing/2016/5/12/chartex" xmlns:cx7="http://schemas.microsoft.com/office/drawing/2016/5/13/chartex" xmlns:cx8="http://schemas.microsoft.com/office/drawing/2016/5/14/chartex" xmlns:mc="http://schemas.openxmlformats.org/markup-compatibility/2006" xmlns:aink="http://schemas.microsoft.com/office/drawing/2016/ink" xmlns:am3d="http://schemas.microsoft.com/office/drawing/2017/model3d" xmlns:o="urn:schemas-microsoft-com:office:office" xmlns:r="http://schemas.openxmlformats.org/officeDocument/2006/relationships" xmlns:m="http://schemas.openxmlformats.org/officeDocument/2006/math" xmlns:v="urn:schemas-microsoft-com:vml" xmlns:wp14="http://schemas.microsoft.com/office/word/2010/wordprocessingDrawing" xmlns:wp="http://schemas.openxmlformats.org/drawingml/2006/wordprocessingDrawing" xmlns:w10="urn:schemas-microsoft-com:office:word" xmlns:w="http://schemas.openxmlformats.org/wordprocessingml/2006/main" xmlns:w14="http://schemas.microsoft.com/office/word/2010/wordml" xmlns:w15="http://schemas.microsoft.com/office/word/2012/wordml" xmlns:w16cex="http://schemas.microsoft.com/office/word/2018/wordml/cex" xmlns:w16cid="http://schemas.microsoft.com/office/word/2016/wordml/cid" xmlns:w16="http://schemas.microsoft.com/office/word/2018/wordml" xmlns:w16sdtdh="http://schemas.microsoft.com/office/word/2020/wordml/sdtdatahash" xmlns:w16se="http://schemas.microsoft.com/office/word/2015/wordml/symex" xmlns:wpg="http://schemas.microsoft.com/office/word/2010/wordprocessingGroup" xmlns:wpi="http://schemas.microsoft.com/office/word/2010/wordprocessingInk" xmlns:wne="http://schemas.microsoft.com/office/word/2006/wordml" xmlns:wps="http://schemas.microsoft.com/office/word/2010/wordprocessingShape" mc:Ignorable="w14 w15 w16se w16cid w16 w16cex w16sdtdh wp14">
   <w:body>
     <w:p>
       <w:pPr>
@@ -542,7 +542,10 @@
               </w:rPr>
             </w:pPr>
             <w:r>
-              <w:t>Phạm Phước Hảo</w:t>
+              <w:t>Phạm Phước H</w:t>
+            </w:r>
+            <w:r>
+              <w:t>ão</w:t>
             </w:r>
           </w:p>
         </w:tc>
@@ -1072,6 +1075,7 @@
                 <w:color w:val="000000"/>
                 <w:szCs w:val="26"/>
               </w:rPr>
+              <w:lastRenderedPageBreak/>
               <w:t>2</w:t>
             </w:r>
           </w:p>
@@ -1209,7 +1213,6 @@
                 <w:color w:val="000000"/>
                 <w:szCs w:val="26"/>
               </w:rPr>
-              <w:lastRenderedPageBreak/>
               <w:t>3</w:t>
             </w:r>
           </w:p>
@@ -2812,7 +2815,11 @@
         <w:spacing w:after="160" w:line="276" w:lineRule="auto"/>
       </w:pPr>
       <w:r>
-        <w:t>Các biến thời tiết đều ở dạng số liên tục nên dùng được trực tiếp cho thống kê mô tả, tương quan và hồi quy; Seasons, Holiday và Functioning Day là biến phân loại nên phải mã hóa trước khi đưa vào mô hình. Riêng cột Date ở dạng chuỗi, được chuyển sang kiểu ngày để tách thêm tháng, thứ trong tuần và dấu hiệu cuối tuần phục vụ phân tích theo thời gian.</w:t>
+        <w:t xml:space="preserve">Các biến thời tiết đều ở dạng số liên tục nên dùng được trực tiếp cho thống kê mô tả, tương quan và hồi quy; Seasons, Holiday và Functioning Day là biến phân loại nên phải mã hóa trước khi đưa vào mô hình. Riêng cột Date ở dạng chuỗi, được chuyển sang </w:t>
+      </w:r>
+      <w:r>
+        <w:lastRenderedPageBreak/>
+        <w:t>kiểu ngày để tách thêm tháng, thứ trong tuần và dấu hiệu cuối tuần phục vụ phân tích theo thời gian.</w:t>
       </w:r>
     </w:p>
     <w:p/>
@@ -2824,7 +2831,6 @@
         <w:rPr>
           <w:lang w:val="en-US"/>
         </w:rPr>
-        <w:lastRenderedPageBreak/>
         <w:tab/>
         <w:t>PHƯƠNG PHÁP PHÂN TÍCH</w:t>
       </w:r>
@@ -2944,7 +2950,11 @@
         <w:jc w:val="left"/>
       </w:pPr>
       <w:r>
-        <w:t>Dữ liệu không có giá trị khuyết hay trùng lặp nên không phải điền giá trị hoặc xóa dòng. Trên toàn bộ 8.760 giờ, có 158 giờ vượt ngưỡng IQR phía trên của Rented Bike Count (2.376,625 lượt), nhưng chưa đủ cơ sở coi đây là lỗi đo lường; nhóm giữ nguyên để các thành viên tiếp theo phân tích. Toàn bộ 295 giá trị 0 xuất hiện trong các giờ hệ thống không hoạt động, vì vậy cũng không bị xóa. Tệp sau xử lý có 8.760 dòng và 17 cột; mọi thay đổi đều có thể chạy lại từ Phần A của notebook Nhom23_Code.ipynb.</w:t>
+        <w:t xml:space="preserve">Dữ liệu không có giá trị khuyết hay trùng lặp nên không phải điền giá trị hoặc xóa dòng. Trên toàn bộ 8.760 giờ, có 158 giờ vượt ngưỡng IQR phía trên của Rented Bike Count (2.376,625 lượt), nhưng chưa đủ cơ sở coi đây là lỗi đo lường; nhóm giữ nguyên để các thành viên tiếp theo phân tích. Toàn bộ 295 giá trị 0 xuất hiện trong các </w:t>
+      </w:r>
+      <w:r>
+        <w:lastRenderedPageBreak/>
+        <w:t>giờ hệ thống không hoạt động, vì vậy cũng không bị xóa. Tệp sau xử lý có 8.760 dòng và 17 cột; mọi thay đổi đều có thể chạy lại từ Phần A của notebook Nhom23_Code.ipynb.</w:t>
       </w:r>
     </w:p>
     <w:p>
@@ -2952,7 +2962,6 @@
         <w:pStyle w:val="Heading2"/>
       </w:pPr>
       <w:r>
-        <w:lastRenderedPageBreak/>
         <w:tab/>
         <w:t>Phạm vi dữ liệu phân tích</w:t>
       </w:r>
@@ -3026,6 +3035,7 @@
         <w:pStyle w:val="-G1"/>
       </w:pPr>
       <w:r>
+        <w:lastRenderedPageBreak/>
         <w:t>Hồi quy tuyến tính đơn: chỉ dùng nhiệt độ, biến có tương quan mạnh nhất với số lượt thuê (r = 0,56).</w:t>
       </w:r>
     </w:p>
@@ -3034,7 +3044,6 @@
         <w:pStyle w:val="-G1"/>
       </w:pPr>
       <w:r>
-        <w:lastRenderedPageBreak/>
         <w:t>Hồi quy tuyến tính đa biến: dùng toàn bộ biến đầu vào nêu trên.</w:t>
       </w:r>
     </w:p>
@@ -4934,8 +4943,6 @@
       </w:pPr>
       <w:r>
         <w:tab/>
-      </w:r>
-      <w:r>
         <w:t>So sánh các mô hình</w:t>
       </w:r>
     </w:p>
@@ -6122,7 +6129,13 @@
               <w:rPr>
                 <w:szCs w:val="26"/>
               </w:rPr>
-              <w:t>Phạm Phước Hảo</w:t>
+              <w:t>Phạm Phước H</w:t>
+            </w:r>
+            <w:r>
+              <w:rPr>
+                <w:szCs w:val="26"/>
+              </w:rPr>
+              <w:t>ão</w:t>
             </w:r>
           </w:p>
         </w:tc>
@@ -6175,7 +6188,7 @@
 </file>
 
 <file path=word/endnotes.xml><?xml version="1.0" encoding="utf-8"?>
-<w:endnotes xmlns:wpc="http://schemas.microsoft.com/office/word/2010/wordprocessingCanvas" xmlns:cx="http://schemas.microsoft.com/office/drawing/2014/chartex" xmlns:cx1="http://schemas.microsoft.com/office/drawing/2015/9/8/chartex" xmlns:cx2="http://schemas.microsoft.com/office/drawing/2015/10/21/chartex" xmlns:cx3="http://schemas.microsoft.com/office/drawing/2016/5/9/chartex" xmlns:cx4="http://schemas.microsoft.com/office/drawing/2016/5/10/chartex" xmlns:cx5="http://schemas.microsoft.com/office/drawing/2016/5/11/chartex" xmlns:cx6="http://schemas.microsoft.com/office/drawing/2016/5/12/chartex" xmlns:cx7="http://schemas.microsoft.com/office/drawing/2016/5/13/chartex" xmlns:cx8="http://schemas.microsoft.com/office/drawing/2016/5/14/chartex" xmlns:mc="http://schemas.openxmlformats.org/markup-compatibility/2006" xmlns:aink="http://schemas.microsoft.com/office/drawing/2016/ink" xmlns:am3d="http://schemas.microsoft.com/office/drawing/2017/model3d" xmlns:o="urn:schemas-microsoft-com:office:office" xmlns:oel="http://schemas.microsoft.com/office/2019/extlst" xmlns:r="http://schemas.openxmlformats.org/officeDocument/2006/relationships" xmlns:m="http://schemas.openxmlformats.org/officeDocument/2006/math" xmlns:v="urn:schemas-microsoft-com:vml" xmlns:wp14="http://schemas.microsoft.com/office/word/2010/wordprocessingDrawing" xmlns:wp="http://schemas.openxmlformats.org/drawingml/2006/wordprocessingDrawing" xmlns:w10="urn:schemas-microsoft-com:office:word" xmlns:w="http://schemas.openxmlformats.org/wordprocessingml/2006/main" xmlns:w14="http://schemas.microsoft.com/office/word/2010/wordml" xmlns:w15="http://schemas.microsoft.com/office/word/2012/wordml" xmlns:w16cex="http://schemas.microsoft.com/office/word/2018/wordml/cex" xmlns:w16cid="http://schemas.microsoft.com/office/word/2016/wordml/cid" xmlns:w16="http://schemas.microsoft.com/office/word/2018/wordml" xmlns:w16du="http://schemas.microsoft.com/office/word/2023/wordml/word16du" xmlns:w16sdtdh="http://schemas.microsoft.com/office/word/2020/wordml/sdtdatahash" xmlns:w16sdtfl="http://schemas.microsoft.com/office/word/2024/wordml/sdtformatlock" xmlns:w16se="http://schemas.microsoft.com/office/word/2015/wordml/symex" xmlns:wpg="http://schemas.microsoft.com/office/word/2010/wordprocessingGroup" xmlns:wpi="http://schemas.microsoft.com/office/word/2010/wordprocessingInk" xmlns:wne="http://schemas.microsoft.com/office/word/2006/wordml" xmlns:wps="http://schemas.microsoft.com/office/word/2010/wordprocessingShape" mc:Ignorable="w14 w15 w16se w16cid w16 w16cex w16sdtdh w16sdtfl w16du wp14">
+<w:endnotes xmlns:wpc="http://schemas.microsoft.com/office/word/2010/wordprocessingCanvas" xmlns:cx="http://schemas.microsoft.com/office/drawing/2014/chartex" xmlns:cx1="http://schemas.microsoft.com/office/drawing/2015/9/8/chartex" xmlns:cx2="http://schemas.microsoft.com/office/drawing/2015/10/21/chartex" xmlns:cx3="http://schemas.microsoft.com/office/drawing/2016/5/9/chartex" xmlns:cx4="http://schemas.microsoft.com/office/drawing/2016/5/10/chartex" xmlns:cx5="http://schemas.microsoft.com/office/drawing/2016/5/11/chartex" xmlns:cx6="http://schemas.microsoft.com/office/drawing/2016/5/12/chartex" xmlns:cx7="http://schemas.microsoft.com/office/drawing/2016/5/13/chartex" xmlns:cx8="http://schemas.microsoft.com/office/drawing/2016/5/14/chartex" xmlns:mc="http://schemas.openxmlformats.org/markup-compatibility/2006" xmlns:aink="http://schemas.microsoft.com/office/drawing/2016/ink" xmlns:am3d="http://schemas.microsoft.com/office/drawing/2017/model3d" xmlns:o="urn:schemas-microsoft-com:office:office" xmlns:r="http://schemas.openxmlformats.org/officeDocument/2006/relationships" xmlns:m="http://schemas.openxmlformats.org/officeDocument/2006/math" xmlns:v="urn:schemas-microsoft-com:vml" xmlns:wp14="http://schemas.microsoft.com/office/word/2010/wordprocessingDrawing" xmlns:wp="http://schemas.openxmlformats.org/drawingml/2006/wordprocessingDrawing" xmlns:w10="urn:schemas-microsoft-com:office:word" xmlns:w="http://schemas.openxmlformats.org/wordprocessingml/2006/main" xmlns:w14="http://schemas.microsoft.com/office/word/2010/wordml" xmlns:w15="http://schemas.microsoft.com/office/word/2012/wordml" xmlns:w16cex="http://schemas.microsoft.com/office/word/2018/wordml/cex" xmlns:w16cid="http://schemas.microsoft.com/office/word/2016/wordml/cid" xmlns:w16="http://schemas.microsoft.com/office/word/2018/wordml" xmlns:w16sdtdh="http://schemas.microsoft.com/office/word/2020/wordml/sdtdatahash" xmlns:w16se="http://schemas.microsoft.com/office/word/2015/wordml/symex" xmlns:wpg="http://schemas.microsoft.com/office/word/2010/wordprocessingGroup" xmlns:wpi="http://schemas.microsoft.com/office/word/2010/wordprocessingInk" xmlns:wne="http://schemas.microsoft.com/office/word/2006/wordml" xmlns:wps="http://schemas.microsoft.com/office/word/2010/wordprocessingShape" mc:Ignorable="w14 w15 w16se w16cid w16 w16cex w16sdtdh wp14">
   <w:endnote w:type="separator" w:id="-1">
     <w:p>
       <w:pPr>
@@ -6200,7 +6213,7 @@
 </file>
 
 <file path=word/footer1.xml><?xml version="1.0" encoding="utf-8"?>
-<w:ftr xmlns:wpc="http://schemas.microsoft.com/office/word/2010/wordprocessingCanvas" xmlns:cx="http://schemas.microsoft.com/office/drawing/2014/chartex" xmlns:cx1="http://schemas.microsoft.com/office/drawing/2015/9/8/chartex" xmlns:cx2="http://schemas.microsoft.com/office/drawing/2015/10/21/chartex" xmlns:cx3="http://schemas.microsoft.com/office/drawing/2016/5/9/chartex" xmlns:cx4="http://schemas.microsoft.com/office/drawing/2016/5/10/chartex" xmlns:cx5="http://schemas.microsoft.com/office/drawing/2016/5/11/chartex" xmlns:cx6="http://schemas.microsoft.com/office/drawing/2016/5/12/chartex" xmlns:cx7="http://schemas.microsoft.com/office/drawing/2016/5/13/chartex" xmlns:cx8="http://schemas.microsoft.com/office/drawing/2016/5/14/chartex" xmlns:mc="http://schemas.openxmlformats.org/markup-compatibility/2006" xmlns:aink="http://schemas.microsoft.com/office/drawing/2016/ink" xmlns:am3d="http://schemas.microsoft.com/office/drawing/2017/model3d" xmlns:o="urn:schemas-microsoft-com:office:office" xmlns:oel="http://schemas.microsoft.com/office/2019/extlst" xmlns:r="http://schemas.openxmlformats.org/officeDocument/2006/relationships" xmlns:m="http://schemas.openxmlformats.org/officeDocument/2006/math" xmlns:v="urn:schemas-microsoft-com:vml" xmlns:wp14="http://schemas.microsoft.com/office/word/2010/wordprocessingDrawing" xmlns:wp="http://schemas.openxmlformats.org/drawingml/2006/wordprocessingDrawing" xmlns:w10="urn:schemas-microsoft-com:office:word" xmlns:w="http://schemas.openxmlformats.org/wordprocessingml/2006/main" xmlns:w14="http://schemas.microsoft.com/office/word/2010/wordml" xmlns:w15="http://schemas.microsoft.com/office/word/2012/wordml" xmlns:w16cex="http://schemas.microsoft.com/office/word/2018/wordml/cex" xmlns:w16cid="http://schemas.microsoft.com/office/word/2016/wordml/cid" xmlns:w16="http://schemas.microsoft.com/office/word/2018/wordml" xmlns:w16du="http://schemas.microsoft.com/office/word/2023/wordml/word16du" xmlns:w16sdtdh="http://schemas.microsoft.com/office/word/2020/wordml/sdtdatahash" xmlns:w16sdtfl="http://schemas.microsoft.com/office/word/2024/wordml/sdtformatlock" xmlns:w16se="http://schemas.microsoft.com/office/word/2015/wordml/symex" xmlns:wpg="http://schemas.microsoft.com/office/word/2010/wordprocessingGroup" xmlns:wpi="http://schemas.microsoft.com/office/word/2010/wordprocessingInk" xmlns:wne="http://schemas.microsoft.com/office/word/2006/wordml" xmlns:wps="http://schemas.microsoft.com/office/word/2010/wordprocessingShape" mc:Ignorable="w14 w15 w16se w16cid w16 w16cex w16sdtdh w16sdtfl w16du wp14">
+<w:ftr xmlns:wpc="http://schemas.microsoft.com/office/word/2010/wordprocessingCanvas" xmlns:cx="http://schemas.microsoft.com/office/drawing/2014/chartex" xmlns:cx1="http://schemas.microsoft.com/office/drawing/2015/9/8/chartex" xmlns:cx2="http://schemas.microsoft.com/office/drawing/2015/10/21/chartex" xmlns:cx3="http://schemas.microsoft.com/office/drawing/2016/5/9/chartex" xmlns:cx4="http://schemas.microsoft.com/office/drawing/2016/5/10/chartex" xmlns:cx5="http://schemas.microsoft.com/office/drawing/2016/5/11/chartex" xmlns:cx6="http://schemas.microsoft.com/office/drawing/2016/5/12/chartex" xmlns:cx7="http://schemas.microsoft.com/office/drawing/2016/5/13/chartex" xmlns:cx8="http://schemas.microsoft.com/office/drawing/2016/5/14/chartex" xmlns:mc="http://schemas.openxmlformats.org/markup-compatibility/2006" xmlns:aink="http://schemas.microsoft.com/office/drawing/2016/ink" xmlns:am3d="http://schemas.microsoft.com/office/drawing/2017/model3d" xmlns:o="urn:schemas-microsoft-com:office:office" xmlns:r="http://schemas.openxmlformats.org/officeDocument/2006/relationships" xmlns:m="http://schemas.openxmlformats.org/officeDocument/2006/math" xmlns:v="urn:schemas-microsoft-com:vml" xmlns:wp14="http://schemas.microsoft.com/office/word/2010/wordprocessingDrawing" xmlns:wp="http://schemas.openxmlformats.org/drawingml/2006/wordprocessingDrawing" xmlns:w10="urn:schemas-microsoft-com:office:word" xmlns:w="http://schemas.openxmlformats.org/wordprocessingml/2006/main" xmlns:w14="http://schemas.microsoft.com/office/word/2010/wordml" xmlns:w15="http://schemas.microsoft.com/office/word/2012/wordml" xmlns:w16cex="http://schemas.microsoft.com/office/word/2018/wordml/cex" xmlns:w16cid="http://schemas.microsoft.com/office/word/2016/wordml/cid" xmlns:w16="http://schemas.microsoft.com/office/word/2018/wordml" xmlns:w16sdtdh="http://schemas.microsoft.com/office/word/2020/wordml/sdtdatahash" xmlns:w16se="http://schemas.microsoft.com/office/word/2015/wordml/symex" xmlns:wpg="http://schemas.microsoft.com/office/word/2010/wordprocessingGroup" xmlns:wpi="http://schemas.microsoft.com/office/word/2010/wordprocessingInk" xmlns:wne="http://schemas.microsoft.com/office/word/2006/wordml" xmlns:wps="http://schemas.microsoft.com/office/word/2010/wordprocessingShape" mc:Ignorable="w14 w15 w16se w16cid w16 w16cex w16sdtdh wp14">
   <w:p>
     <w:pPr>
       <w:pStyle w:val="Footer"/>
@@ -6255,7 +6268,13 @@
         <w:i/>
         <w:lang w:val="vi-VN"/>
       </w:rPr>
-      <w:t>Phạm Phước Hảo</w:t>
+      <w:t>Phạm Phước H</w:t>
+    </w:r>
+    <w:r>
+      <w:rPr>
+        <w:i/>
+      </w:rPr>
+      <w:t>ão</w:t>
     </w:r>
     <w:r>
       <w:tab/>
@@ -6325,7 +6344,7 @@
             </wp:anchor>
           </w:drawing>
         </mc:Choice>
-        <mc:Fallback>
+        <mc:Fallback xmlns:w16sdtfl="http://schemas.microsoft.com/office/word/2024/wordml/sdtformatlock" xmlns:w16du="http://schemas.microsoft.com/office/word/2023/wordml/word16du" xmlns:oel="http://schemas.microsoft.com/office/2019/extlst">
           <w:pict>
             <v:line w14:anchorId="5454541B" id="Straight Connector 1" o:spid="_x0000_s1026" style="position:absolute;z-index:251661312;visibility:visible;mso-wrap-style:square;mso-width-percent:0;mso-wrap-distance-left:9pt;mso-wrap-distance-top:0;mso-wrap-distance-right:9pt;mso-wrap-distance-bottom:0;mso-position-horizontal:absolute;mso-position-horizontal-relative:text;mso-position-vertical:absolute;mso-position-vertical-relative:text;mso-width-percent:0;mso-width-relative:margin" from="-1.05pt,-4.85pt" to="452.5pt,-4.85pt" o:gfxdata="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" strokecolor="black [3213]" strokeweight=".5pt">
               <v:stroke joinstyle="miter"/>
@@ -6360,7 +6379,7 @@
 </file>
 
 <file path=word/footer2.xml><?xml version="1.0" encoding="utf-8"?>
-<w:ftr xmlns:wpc="http://schemas.microsoft.com/office/word/2010/wordprocessingCanvas" xmlns:cx="http://schemas.microsoft.com/office/drawing/2014/chartex" xmlns:cx1="http://schemas.microsoft.com/office/drawing/2015/9/8/chartex" xmlns:cx2="http://schemas.microsoft.com/office/drawing/2015/10/21/chartex" xmlns:cx3="http://schemas.microsoft.com/office/drawing/2016/5/9/chartex" xmlns:cx4="http://schemas.microsoft.com/office/drawing/2016/5/10/chartex" xmlns:cx5="http://schemas.microsoft.com/office/drawing/2016/5/11/chartex" xmlns:cx6="http://schemas.microsoft.com/office/drawing/2016/5/12/chartex" xmlns:cx7="http://schemas.microsoft.com/office/drawing/2016/5/13/chartex" xmlns:cx8="http://schemas.microsoft.com/office/drawing/2016/5/14/chartex" xmlns:mc="http://schemas.openxmlformats.org/markup-compatibility/2006" xmlns:aink="http://schemas.microsoft.com/office/drawing/2016/ink" xmlns:am3d="http://schemas.microsoft.com/office/drawing/2017/model3d" xmlns:o="urn:schemas-microsoft-com:office:office" xmlns:oel="http://schemas.microsoft.com/office/2019/extlst" xmlns:r="http://schemas.openxmlformats.org/officeDocument/2006/relationships" xmlns:m="http://schemas.openxmlformats.org/officeDocument/2006/math" xmlns:v="urn:schemas-microsoft-com:vml" xmlns:wp14="http://schemas.microsoft.com/office/word/2010/wordprocessingDrawing" xmlns:wp="http://schemas.openxmlformats.org/drawingml/2006/wordprocessingDrawing" xmlns:w10="urn:schemas-microsoft-com:office:word" xmlns:w="http://schemas.openxmlformats.org/wordprocessingml/2006/main" xmlns:w14="http://schemas.microsoft.com/office/word/2010/wordml" xmlns:w15="http://schemas.microsoft.com/office/word/2012/wordml" xmlns:w16cex="http://schemas.microsoft.com/office/word/2018/wordml/cex" xmlns:w16cid="http://schemas.microsoft.com/office/word/2016/wordml/cid" xmlns:w16="http://schemas.microsoft.com/office/word/2018/wordml" xmlns:w16du="http://schemas.microsoft.com/office/word/2023/wordml/word16du" xmlns:w16sdtdh="http://schemas.microsoft.com/office/word/2020/wordml/sdtdatahash" xmlns:w16sdtfl="http://schemas.microsoft.com/office/word/2024/wordml/sdtformatlock" xmlns:w16se="http://schemas.microsoft.com/office/word/2015/wordml/symex" xmlns:wpg="http://schemas.microsoft.com/office/word/2010/wordprocessingGroup" xmlns:wpi="http://schemas.microsoft.com/office/word/2010/wordprocessingInk" xmlns:wne="http://schemas.microsoft.com/office/word/2006/wordml" xmlns:wps="http://schemas.microsoft.com/office/word/2010/wordprocessingShape" mc:Ignorable="w14 w15 w16se w16cid w16 w16cex w16sdtdh w16sdtfl w16du wp14">
+<w:ftr xmlns:wpc="http://schemas.microsoft.com/office/word/2010/wordprocessingCanvas" xmlns:cx="http://schemas.microsoft.com/office/drawing/2014/chartex" xmlns:cx1="http://schemas.microsoft.com/office/drawing/2015/9/8/chartex" xmlns:cx2="http://schemas.microsoft.com/office/drawing/2015/10/21/chartex" xmlns:cx3="http://schemas.microsoft.com/office/drawing/2016/5/9/chartex" xmlns:cx4="http://schemas.microsoft.com/office/drawing/2016/5/10/chartex" xmlns:cx5="http://schemas.microsoft.com/office/drawing/2016/5/11/chartex" xmlns:cx6="http://schemas.microsoft.com/office/drawing/2016/5/12/chartex" xmlns:cx7="http://schemas.microsoft.com/office/drawing/2016/5/13/chartex" xmlns:cx8="http://schemas.microsoft.com/office/drawing/2016/5/14/chartex" xmlns:mc="http://schemas.openxmlformats.org/markup-compatibility/2006" xmlns:aink="http://schemas.microsoft.com/office/drawing/2016/ink" xmlns:am3d="http://schemas.microsoft.com/office/drawing/2017/model3d" xmlns:o="urn:schemas-microsoft-com:office:office" xmlns:r="http://schemas.openxmlformats.org/officeDocument/2006/relationships" xmlns:m="http://schemas.openxmlformats.org/officeDocument/2006/math" xmlns:v="urn:schemas-microsoft-com:vml" xmlns:wp14="http://schemas.microsoft.com/office/word/2010/wordprocessingDrawing" xmlns:wp="http://schemas.openxmlformats.org/drawingml/2006/wordprocessingDrawing" xmlns:w10="urn:schemas-microsoft-com:office:word" xmlns:w="http://schemas.openxmlformats.org/wordprocessingml/2006/main" xmlns:w14="http://schemas.microsoft.com/office/word/2010/wordml" xmlns:w15="http://schemas.microsoft.com/office/word/2012/wordml" xmlns:w16cex="http://schemas.microsoft.com/office/word/2018/wordml/cex" xmlns:w16cid="http://schemas.microsoft.com/office/word/2016/wordml/cid" xmlns:w16="http://schemas.microsoft.com/office/word/2018/wordml" xmlns:w16sdtdh="http://schemas.microsoft.com/office/word/2020/wordml/sdtdatahash" xmlns:w16se="http://schemas.microsoft.com/office/word/2015/wordml/symex" xmlns:wpg="http://schemas.microsoft.com/office/word/2010/wordprocessingGroup" xmlns:wpi="http://schemas.microsoft.com/office/word/2010/wordprocessingInk" xmlns:wne="http://schemas.microsoft.com/office/word/2006/wordml" xmlns:wps="http://schemas.microsoft.com/office/word/2010/wordprocessingShape" mc:Ignorable="w14 w15 w16se w16cid w16 w16cex w16sdtdh wp14">
   <w:p>
     <w:pPr>
       <w:pStyle w:val="Footer"/>
@@ -6415,7 +6434,13 @@
         <w:i/>
         <w:lang w:val="vi-VN"/>
       </w:rPr>
-      <w:t>Phạm Phước Hảo</w:t>
+      <w:t>Phạm Phước H</w:t>
+    </w:r>
+    <w:r>
+      <w:rPr>
+        <w:i/>
+      </w:rPr>
+      <w:t>ão</w:t>
     </w:r>
     <w:r>
       <w:tab/>
@@ -6485,7 +6510,7 @@
             </wp:anchor>
           </w:drawing>
         </mc:Choice>
-        <mc:Fallback>
+        <mc:Fallback xmlns:w16sdtfl="http://schemas.microsoft.com/office/word/2024/wordml/sdtformatlock" xmlns:w16du="http://schemas.microsoft.com/office/word/2023/wordml/word16du" xmlns:oel="http://schemas.microsoft.com/office/2019/extlst">
           <w:pict>
             <v:line w14:anchorId="4EE764DD" id="Straight Connector 1098505071" o:spid="_x0000_s1026" style="position:absolute;z-index:251667456;visibility:visible;mso-wrap-style:square;mso-width-percent:0;mso-wrap-distance-left:9pt;mso-wrap-distance-top:0;mso-wrap-distance-right:9pt;mso-wrap-distance-bottom:0;mso-position-horizontal:absolute;mso-position-horizontal-relative:text;mso-position-vertical:absolute;mso-position-vertical-relative:text;mso-width-percent:0;mso-width-relative:margin" from="-1.05pt,-4.85pt" to="452.5pt,-4.85pt" o:gfxdata="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" strokecolor="black [3213]" strokeweight=".5pt">
               <v:stroke joinstyle="miter"/>
@@ -6499,7 +6524,7 @@
 </file>
 
 <file path=word/footnotes.xml><?xml version="1.0" encoding="utf-8"?>
-<w:footnotes xmlns:wpc="http://schemas.microsoft.com/office/word/2010/wordprocessingCanvas" xmlns:cx="http://schemas.microsoft.com/office/drawing/2014/chartex" xmlns:cx1="http://schemas.microsoft.com/office/drawing/2015/9/8/chartex" xmlns:cx2="http://schemas.microsoft.com/office/drawing/2015/10/21/chartex" xmlns:cx3="http://schemas.microsoft.com/office/drawing/2016/5/9/chartex" xmlns:cx4="http://schemas.microsoft.com/office/drawing/2016/5/10/chartex" xmlns:cx5="http://schemas.microsoft.com/office/drawing/2016/5/11/chartex" xmlns:cx6="http://schemas.microsoft.com/office/drawing/2016/5/12/chartex" xmlns:cx7="http://schemas.microsoft.com/office/drawing/2016/5/13/chartex" xmlns:cx8="http://schemas.microsoft.com/office/drawing/2016/5/14/chartex" xmlns:mc="http://schemas.openxmlformats.org/markup-compatibility/2006" xmlns:aink="http://schemas.microsoft.com/office/drawing/2016/ink" xmlns:am3d="http://schemas.microsoft.com/office/drawing/2017/model3d" xmlns:o="urn:schemas-microsoft-com:office:office" xmlns:oel="http://schemas.microsoft.com/office/2019/extlst" xmlns:r="http://schemas.openxmlformats.org/officeDocument/2006/relationships" xmlns:m="http://schemas.openxmlformats.org/officeDocument/2006/math" xmlns:v="urn:schemas-microsoft-com:vml" xmlns:wp14="http://schemas.microsoft.com/office/word/2010/wordprocessingDrawing" xmlns:wp="http://schemas.openxmlformats.org/drawingml/2006/wordprocessingDrawing" xmlns:w10="urn:schemas-microsoft-com:office:word" xmlns:w="http://schemas.openxmlformats.org/wordprocessingml/2006/main" xmlns:w14="http://schemas.microsoft.com/office/word/2010/wordml" xmlns:w15="http://schemas.microsoft.com/office/word/2012/wordml" xmlns:w16cex="http://schemas.microsoft.com/office/word/2018/wordml/cex" xmlns:w16cid="http://schemas.microsoft.com/office/word/2016/wordml/cid" xmlns:w16="http://schemas.microsoft.com/office/word/2018/wordml" xmlns:w16du="http://schemas.microsoft.com/office/word/2023/wordml/word16du" xmlns:w16sdtdh="http://schemas.microsoft.com/office/word/2020/wordml/sdtdatahash" xmlns:w16sdtfl="http://schemas.microsoft.com/office/word/2024/wordml/sdtformatlock" xmlns:w16se="http://schemas.microsoft.com/office/word/2015/wordml/symex" xmlns:wpg="http://schemas.microsoft.com/office/word/2010/wordprocessingGroup" xmlns:wpi="http://schemas.microsoft.com/office/word/2010/wordprocessingInk" xmlns:wne="http://schemas.microsoft.com/office/word/2006/wordml" xmlns:wps="http://schemas.microsoft.com/office/word/2010/wordprocessingShape" mc:Ignorable="w14 w15 w16se w16cid w16 w16cex w16sdtdh w16sdtfl w16du wp14">
+<w:footnotes xmlns:wpc="http://schemas.microsoft.com/office/word/2010/wordprocessingCanvas" xmlns:cx="http://schemas.microsoft.com/office/drawing/2014/chartex" xmlns:cx1="http://schemas.microsoft.com/office/drawing/2015/9/8/chartex" xmlns:cx2="http://schemas.microsoft.com/office/drawing/2015/10/21/chartex" xmlns:cx3="http://schemas.microsoft.com/office/drawing/2016/5/9/chartex" xmlns:cx4="http://schemas.microsoft.com/office/drawing/2016/5/10/chartex" xmlns:cx5="http://schemas.microsoft.com/office/drawing/2016/5/11/chartex" xmlns:cx6="http://schemas.microsoft.com/office/drawing/2016/5/12/chartex" xmlns:cx7="http://schemas.microsoft.com/office/drawing/2016/5/13/chartex" xmlns:cx8="http://schemas.microsoft.com/office/drawing/2016/5/14/chartex" xmlns:mc="http://schemas.openxmlformats.org/markup-compatibility/2006" xmlns:aink="http://schemas.microsoft.com/office/drawing/2016/ink" xmlns:am3d="http://schemas.microsoft.com/office/drawing/2017/model3d" xmlns:o="urn:schemas-microsoft-com:office:office" xmlns:r="http://schemas.openxmlformats.org/officeDocument/2006/relationships" xmlns:m="http://schemas.openxmlformats.org/officeDocument/2006/math" xmlns:v="urn:schemas-microsoft-com:vml" xmlns:wp14="http://schemas.microsoft.com/office/word/2010/wordprocessingDrawing" xmlns:wp="http://schemas.openxmlformats.org/drawingml/2006/wordprocessingDrawing" xmlns:w10="urn:schemas-microsoft-com:office:word" xmlns:w="http://schemas.openxmlformats.org/wordprocessingml/2006/main" xmlns:w14="http://schemas.microsoft.com/office/word/2010/wordml" xmlns:w15="http://schemas.microsoft.com/office/word/2012/wordml" xmlns:w16cex="http://schemas.microsoft.com/office/word/2018/wordml/cex" xmlns:w16cid="http://schemas.microsoft.com/office/word/2016/wordml/cid" xmlns:w16="http://schemas.microsoft.com/office/word/2018/wordml" xmlns:w16sdtdh="http://schemas.microsoft.com/office/word/2020/wordml/sdtdatahash" xmlns:w16se="http://schemas.microsoft.com/office/word/2015/wordml/symex" xmlns:wpg="http://schemas.microsoft.com/office/word/2010/wordprocessingGroup" xmlns:wpi="http://schemas.microsoft.com/office/word/2010/wordprocessingInk" xmlns:wne="http://schemas.microsoft.com/office/word/2006/wordml" xmlns:wps="http://schemas.microsoft.com/office/word/2010/wordprocessingShape" mc:Ignorable="w14 w15 w16se w16cid w16 w16cex w16sdtdh wp14">
   <w:footnote w:type="separator" w:id="-1">
     <w:p>
       <w:pPr>
@@ -6524,7 +6549,7 @@
 </file>
 
 <file path=word/header1.xml><?xml version="1.0" encoding="utf-8"?>
-<w:hdr xmlns:wpc="http://schemas.microsoft.com/office/word/2010/wordprocessingCanvas" xmlns:cx="http://schemas.microsoft.com/office/drawing/2014/chartex" xmlns:cx1="http://schemas.microsoft.com/office/drawing/2015/9/8/chartex" xmlns:cx2="http://schemas.microsoft.com/office/drawing/2015/10/21/chartex" xmlns:cx3="http://schemas.microsoft.com/office/drawing/2016/5/9/chartex" xmlns:cx4="http://schemas.microsoft.com/office/drawing/2016/5/10/chartex" xmlns:cx5="http://schemas.microsoft.com/office/drawing/2016/5/11/chartex" xmlns:cx6="http://schemas.microsoft.com/office/drawing/2016/5/12/chartex" xmlns:cx7="http://schemas.microsoft.com/office/drawing/2016/5/13/chartex" xmlns:cx8="http://schemas.microsoft.com/office/drawing/2016/5/14/chartex" xmlns:mc="http://schemas.openxmlformats.org/markup-compatibility/2006" xmlns:aink="http://schemas.microsoft.com/office/drawing/2016/ink" xmlns:am3d="http://schemas.microsoft.com/office/drawing/2017/model3d" xmlns:o="urn:schemas-microsoft-com:office:office" xmlns:oel="http://schemas.microsoft.com/office/2019/extlst" xmlns:r="http://schemas.openxmlformats.org/officeDocument/2006/relationships" xmlns:m="http://schemas.openxmlformats.org/officeDocument/2006/math" xmlns:v="urn:schemas-microsoft-com:vml" xmlns:wp14="http://schemas.microsoft.com/office/word/2010/wordprocessingDrawing" xmlns:wp="http://schemas.openxmlformats.org/drawingml/2006/wordprocessingDrawing" xmlns:w10="urn:schemas-microsoft-com:office:word" xmlns:w="http://schemas.openxmlformats.org/wordprocessingml/2006/main" xmlns:w14="http://schemas.microsoft.com/office/word/2010/wordml" xmlns:w15="http://schemas.microsoft.com/office/word/2012/wordml" xmlns:w16cex="http://schemas.microsoft.com/office/word/2018/wordml/cex" xmlns:w16cid="http://schemas.microsoft.com/office/word/2016/wordml/cid" xmlns:w16="http://schemas.microsoft.com/office/word/2018/wordml" xmlns:w16du="http://schemas.microsoft.com/office/word/2023/wordml/word16du" xmlns:w16sdtdh="http://schemas.microsoft.com/office/word/2020/wordml/sdtdatahash" xmlns:w16sdtfl="http://schemas.microsoft.com/office/word/2024/wordml/sdtformatlock" xmlns:w16se="http://schemas.microsoft.com/office/word/2015/wordml/symex" xmlns:wpg="http://schemas.microsoft.com/office/word/2010/wordprocessingGroup" xmlns:wpi="http://schemas.microsoft.com/office/word/2010/wordprocessingInk" xmlns:wne="http://schemas.microsoft.com/office/word/2006/wordml" xmlns:wps="http://schemas.microsoft.com/office/word/2010/wordprocessingShape" mc:Ignorable="w14 w15 w16se w16cid w16 w16cex w16sdtdh w16sdtfl w16du wp14">
+<w:hdr xmlns:wpc="http://schemas.microsoft.com/office/word/2010/wordprocessingCanvas" xmlns:cx="http://schemas.microsoft.com/office/drawing/2014/chartex" xmlns:cx1="http://schemas.microsoft.com/office/drawing/2015/9/8/chartex" xmlns:cx2="http://schemas.microsoft.com/office/drawing/2015/10/21/chartex" xmlns:cx3="http://schemas.microsoft.com/office/drawing/2016/5/9/chartex" xmlns:cx4="http://schemas.microsoft.com/office/drawing/2016/5/10/chartex" xmlns:cx5="http://schemas.microsoft.com/office/drawing/2016/5/11/chartex" xmlns:cx6="http://schemas.microsoft.com/office/drawing/2016/5/12/chartex" xmlns:cx7="http://schemas.microsoft.com/office/drawing/2016/5/13/chartex" xmlns:cx8="http://schemas.microsoft.com/office/drawing/2016/5/14/chartex" xmlns:mc="http://schemas.openxmlformats.org/markup-compatibility/2006" xmlns:aink="http://schemas.microsoft.com/office/drawing/2016/ink" xmlns:am3d="http://schemas.microsoft.com/office/drawing/2017/model3d" xmlns:o="urn:schemas-microsoft-com:office:office" xmlns:r="http://schemas.openxmlformats.org/officeDocument/2006/relationships" xmlns:m="http://schemas.openxmlformats.org/officeDocument/2006/math" xmlns:v="urn:schemas-microsoft-com:vml" xmlns:wp14="http://schemas.microsoft.com/office/word/2010/wordprocessingDrawing" xmlns:wp="http://schemas.openxmlformats.org/drawingml/2006/wordprocessingDrawing" xmlns:w10="urn:schemas-microsoft-com:office:word" xmlns:w="http://schemas.openxmlformats.org/wordprocessingml/2006/main" xmlns:w14="http://schemas.microsoft.com/office/word/2010/wordml" xmlns:w15="http://schemas.microsoft.com/office/word/2012/wordml" xmlns:w16cex="http://schemas.microsoft.com/office/word/2018/wordml/cex" xmlns:w16cid="http://schemas.microsoft.com/office/word/2016/wordml/cid" xmlns:w16="http://schemas.microsoft.com/office/word/2018/wordml" xmlns:w16sdtdh="http://schemas.microsoft.com/office/word/2020/wordml/sdtdatahash" xmlns:w16se="http://schemas.microsoft.com/office/word/2015/wordml/symex" xmlns:wpg="http://schemas.microsoft.com/office/word/2010/wordprocessingGroup" xmlns:wpi="http://schemas.microsoft.com/office/word/2010/wordprocessingInk" xmlns:wne="http://schemas.microsoft.com/office/word/2006/wordml" xmlns:wps="http://schemas.microsoft.com/office/word/2010/wordprocessingShape" mc:Ignorable="w14 w15 w16se w16cid w16 w16cex w16sdtdh wp14">
   <w:p>
     <w:pPr>
       <w:pStyle w:val="Header"/>
@@ -6595,7 +6620,7 @@
             </wp:anchor>
           </w:drawing>
         </mc:Choice>
-        <mc:Fallback>
+        <mc:Fallback xmlns:w16sdtfl="http://schemas.microsoft.com/office/word/2024/wordml/sdtformatlock" xmlns:w16du="http://schemas.microsoft.com/office/word/2023/wordml/word16du" xmlns:oel="http://schemas.microsoft.com/office/2019/extlst">
           <w:pict>
             <v:line w14:anchorId="2C914AFC" id="Straight Connector 3" o:spid="_x0000_s1026" style="position:absolute;z-index:251663360;visibility:visible;mso-wrap-style:square;mso-width-percent:0;mso-wrap-distance-left:9pt;mso-wrap-distance-top:0;mso-wrap-distance-right:9pt;mso-wrap-distance-bottom:0;mso-position-horizontal:absolute;mso-position-horizontal-relative:text;mso-position-vertical:absolute;mso-position-vertical-relative:text;mso-width-percent:0;mso-width-relative:margin" from="0,16.45pt" to="453.55pt,16.45pt" o:gfxdata="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" strokecolor="black [3213]" strokeweight=".5pt">
               <v:stroke joinstyle="miter"/>
@@ -6644,7 +6669,7 @@
 </file>
 
 <file path=word/header2.xml><?xml version="1.0" encoding="utf-8"?>
-<w:hdr xmlns:wpc="http://schemas.microsoft.com/office/word/2010/wordprocessingCanvas" xmlns:cx="http://schemas.microsoft.com/office/drawing/2014/chartex" xmlns:cx1="http://schemas.microsoft.com/office/drawing/2015/9/8/chartex" xmlns:cx2="http://schemas.microsoft.com/office/drawing/2015/10/21/chartex" xmlns:cx3="http://schemas.microsoft.com/office/drawing/2016/5/9/chartex" xmlns:cx4="http://schemas.microsoft.com/office/drawing/2016/5/10/chartex" xmlns:cx5="http://schemas.microsoft.com/office/drawing/2016/5/11/chartex" xmlns:cx6="http://schemas.microsoft.com/office/drawing/2016/5/12/chartex" xmlns:cx7="http://schemas.microsoft.com/office/drawing/2016/5/13/chartex" xmlns:cx8="http://schemas.microsoft.com/office/drawing/2016/5/14/chartex" xmlns:mc="http://schemas.openxmlformats.org/markup-compatibility/2006" xmlns:aink="http://schemas.microsoft.com/office/drawing/2016/ink" xmlns:am3d="http://schemas.microsoft.com/office/drawing/2017/model3d" xmlns:o="urn:schemas-microsoft-com:office:office" xmlns:oel="http://schemas.microsoft.com/office/2019/extlst" xmlns:r="http://schemas.openxmlformats.org/officeDocument/2006/relationships" xmlns:m="http://schemas.openxmlformats.org/officeDocument/2006/math" xmlns:v="urn:schemas-microsoft-com:vml" xmlns:wp14="http://schemas.microsoft.com/office/word/2010/wordprocessingDrawing" xmlns:wp="http://schemas.openxmlformats.org/drawingml/2006/wordprocessingDrawing" xmlns:w10="urn:schemas-microsoft-com:office:word" xmlns:w="http://schemas.openxmlformats.org/wordprocessingml/2006/main" xmlns:w14="http://schemas.microsoft.com/office/word/2010/wordml" xmlns:w15="http://schemas.microsoft.com/office/word/2012/wordml" xmlns:w16cex="http://schemas.microsoft.com/office/word/2018/wordml/cex" xmlns:w16cid="http://schemas.microsoft.com/office/word/2016/wordml/cid" xmlns:w16="http://schemas.microsoft.com/office/word/2018/wordml" xmlns:w16du="http://schemas.microsoft.com/office/word/2023/wordml/word16du" xmlns:w16sdtdh="http://schemas.microsoft.com/office/word/2020/wordml/sdtdatahash" xmlns:w16sdtfl="http://schemas.microsoft.com/office/word/2024/wordml/sdtformatlock" xmlns:w16se="http://schemas.microsoft.com/office/word/2015/wordml/symex" xmlns:wpg="http://schemas.microsoft.com/office/word/2010/wordprocessingGroup" xmlns:wpi="http://schemas.microsoft.com/office/word/2010/wordprocessingInk" xmlns:wne="http://schemas.microsoft.com/office/word/2006/wordml" xmlns:wps="http://schemas.microsoft.com/office/word/2010/wordprocessingShape" mc:Ignorable="w14 w15 w16se w16cid w16 w16cex w16sdtdh w16sdtfl w16du wp14">
+<w:hdr xmlns:wpc="http://schemas.microsoft.com/office/word/2010/wordprocessingCanvas" xmlns:cx="http://schemas.microsoft.com/office/drawing/2014/chartex" xmlns:cx1="http://schemas.microsoft.com/office/drawing/2015/9/8/chartex" xmlns:cx2="http://schemas.microsoft.com/office/drawing/2015/10/21/chartex" xmlns:cx3="http://schemas.microsoft.com/office/drawing/2016/5/9/chartex" xmlns:cx4="http://schemas.microsoft.com/office/drawing/2016/5/10/chartex" xmlns:cx5="http://schemas.microsoft.com/office/drawing/2016/5/11/chartex" xmlns:cx6="http://schemas.microsoft.com/office/drawing/2016/5/12/chartex" xmlns:cx7="http://schemas.microsoft.com/office/drawing/2016/5/13/chartex" xmlns:cx8="http://schemas.microsoft.com/office/drawing/2016/5/14/chartex" xmlns:mc="http://schemas.openxmlformats.org/markup-compatibility/2006" xmlns:aink="http://schemas.microsoft.com/office/drawing/2016/ink" xmlns:am3d="http://schemas.microsoft.com/office/drawing/2017/model3d" xmlns:o="urn:schemas-microsoft-com:office:office" xmlns:r="http://schemas.openxmlformats.org/officeDocument/2006/relationships" xmlns:m="http://schemas.openxmlformats.org/officeDocument/2006/math" xmlns:v="urn:schemas-microsoft-com:vml" xmlns:wp14="http://schemas.microsoft.com/office/word/2010/wordprocessingDrawing" xmlns:wp="http://schemas.openxmlformats.org/drawingml/2006/wordprocessingDrawing" xmlns:w10="urn:schemas-microsoft-com:office:word" xmlns:w="http://schemas.openxmlformats.org/wordprocessingml/2006/main" xmlns:w14="http://schemas.microsoft.com/office/word/2010/wordml" xmlns:w15="http://schemas.microsoft.com/office/word/2012/wordml" xmlns:w16cex="http://schemas.microsoft.com/office/word/2018/wordml/cex" xmlns:w16cid="http://schemas.microsoft.com/office/word/2016/wordml/cid" xmlns:w16="http://schemas.microsoft.com/office/word/2018/wordml" xmlns:w16sdtdh="http://schemas.microsoft.com/office/word/2020/wordml/sdtdatahash" xmlns:w16se="http://schemas.microsoft.com/office/word/2015/wordml/symex" xmlns:wpg="http://schemas.microsoft.com/office/word/2010/wordprocessingGroup" xmlns:wpi="http://schemas.microsoft.com/office/word/2010/wordprocessingInk" xmlns:wne="http://schemas.microsoft.com/office/word/2006/wordml" xmlns:wps="http://schemas.microsoft.com/office/word/2010/wordprocessingShape" mc:Ignorable="w14 w15 w16se w16cid w16 w16cex w16sdtdh wp14">
   <w:p>
     <w:pPr>
       <w:pStyle w:val="Header"/>
@@ -6715,7 +6740,7 @@
             </wp:anchor>
           </w:drawing>
         </mc:Choice>
-        <mc:Fallback>
+        <mc:Fallback xmlns:w16sdtfl="http://schemas.microsoft.com/office/word/2024/wordml/sdtformatlock" xmlns:w16du="http://schemas.microsoft.com/office/word/2023/wordml/word16du" xmlns:oel="http://schemas.microsoft.com/office/2019/extlst">
           <w:pict>
             <v:line w14:anchorId="61950F7B" id="Straight Connector 812994823" o:spid="_x0000_s1026" style="position:absolute;z-index:251665408;visibility:visible;mso-wrap-style:square;mso-width-percent:0;mso-wrap-distance-left:9pt;mso-wrap-distance-top:0;mso-wrap-distance-right:9pt;mso-wrap-distance-bottom:0;mso-position-horizontal:absolute;mso-position-horizontal-relative:text;mso-position-vertical:absolute;mso-position-vertical-relative:text;mso-width-percent:0;mso-width-relative:margin" from="0,16.45pt" to="453.55pt,16.45pt" o:gfxdata="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" strokecolor="black [3213]" strokeweight=".5pt">
               <v:stroke joinstyle="miter"/>
@@ -6764,7 +6789,7 @@
 </file>
 
 <file path=word/numbering.xml><?xml version="1.0" encoding="utf-8"?>
-<w:numbering xmlns:wpc="http://schemas.microsoft.com/office/word/2010/wordprocessingCanvas" xmlns:cx="http://schemas.microsoft.com/office/drawing/2014/chartex" xmlns:cx1="http://schemas.microsoft.com/office/drawing/2015/9/8/chartex" xmlns:cx2="http://schemas.microsoft.com/office/drawing/2015/10/21/chartex" xmlns:cx3="http://schemas.microsoft.com/office/drawing/2016/5/9/chartex" xmlns:cx4="http://schemas.microsoft.com/office/drawing/2016/5/10/chartex" xmlns:cx5="http://schemas.microsoft.com/office/drawing/2016/5/11/chartex" xmlns:cx6="http://schemas.microsoft.com/office/drawing/2016/5/12/chartex" xmlns:cx7="http://schemas.microsoft.com/office/drawing/2016/5/13/chartex" xmlns:cx8="http://schemas.microsoft.com/office/drawing/2016/5/14/chartex" xmlns:mc="http://schemas.openxmlformats.org/markup-compatibility/2006" xmlns:aink="http://schemas.microsoft.com/office/drawing/2016/ink" xmlns:am3d="http://schemas.microsoft.com/office/drawing/2017/model3d" xmlns:o="urn:schemas-microsoft-com:office:office" xmlns:oel="http://schemas.microsoft.com/office/2019/extlst" xmlns:r="http://schemas.openxmlformats.org/officeDocument/2006/relationships" xmlns:m="http://schemas.openxmlformats.org/officeDocument/2006/math" xmlns:v="urn:schemas-microsoft-com:vml" xmlns:wp14="http://schemas.microsoft.com/office/word/2010/wordprocessingDrawing" xmlns:wp="http://schemas.openxmlformats.org/drawingml/2006/wordprocessingDrawing" xmlns:w10="urn:schemas-microsoft-com:office:word" xmlns:w="http://schemas.openxmlformats.org/wordprocessingml/2006/main" xmlns:w14="http://schemas.microsoft.com/office/word/2010/wordml" xmlns:w15="http://schemas.microsoft.com/office/word/2012/wordml" xmlns:w16cex="http://schemas.microsoft.com/office/word/2018/wordml/cex" xmlns:w16cid="http://schemas.microsoft.com/office/word/2016/wordml/cid" xmlns:w16="http://schemas.microsoft.com/office/word/2018/wordml" xmlns:w16du="http://schemas.microsoft.com/office/word/2023/wordml/word16du" xmlns:w16sdtdh="http://schemas.microsoft.com/office/word/2020/wordml/sdtdatahash" xmlns:w16sdtfl="http://schemas.microsoft.com/office/word/2024/wordml/sdtformatlock" xmlns:w16se="http://schemas.microsoft.com/office/word/2015/wordml/symex" xmlns:wpg="http://schemas.microsoft.com/office/word/2010/wordprocessingGroup" xmlns:wpi="http://schemas.microsoft.com/office/word/2010/wordprocessingInk" xmlns:wne="http://schemas.microsoft.com/office/word/2006/wordml" xmlns:wps="http://schemas.microsoft.com/office/word/2010/wordprocessingShape" mc:Ignorable="w14 w15 w16se w16cid w16 w16cex w16sdtdh w16sdtfl w16du wp14">
+<w:numbering xmlns:wpc="http://schemas.microsoft.com/office/word/2010/wordprocessingCanvas" xmlns:cx="http://schemas.microsoft.com/office/drawing/2014/chartex" xmlns:cx1="http://schemas.microsoft.com/office/drawing/2015/9/8/chartex" xmlns:cx2="http://schemas.microsoft.com/office/drawing/2015/10/21/chartex" xmlns:cx3="http://schemas.microsoft.com/office/drawing/2016/5/9/chartex" xmlns:cx4="http://schemas.microsoft.com/office/drawing/2016/5/10/chartex" xmlns:cx5="http://schemas.microsoft.com/office/drawing/2016/5/11/chartex" xmlns:cx6="http://schemas.microsoft.com/office/drawing/2016/5/12/chartex" xmlns:cx7="http://schemas.microsoft.com/office/drawing/2016/5/13/chartex" xmlns:cx8="http://schemas.microsoft.com/office/drawing/2016/5/14/chartex" xmlns:mc="http://schemas.openxmlformats.org/markup-compatibility/2006" xmlns:aink="http://schemas.microsoft.com/office/drawing/2016/ink" xmlns:am3d="http://schemas.microsoft.com/office/drawing/2017/model3d" xmlns:o="urn:schemas-microsoft-com:office:office" xmlns:r="http://schemas.openxmlformats.org/officeDocument/2006/relationships" xmlns:m="http://schemas.openxmlformats.org/officeDocument/2006/math" xmlns:v="urn:schemas-microsoft-com:vml" xmlns:wp14="http://schemas.microsoft.com/office/word/2010/wordprocessingDrawing" xmlns:wp="http://schemas.openxmlformats.org/drawingml/2006/wordprocessingDrawing" xmlns:w10="urn:schemas-microsoft-com:office:word" xmlns:w="http://schemas.openxmlformats.org/wordprocessingml/2006/main" xmlns:w14="http://schemas.microsoft.com/office/word/2010/wordml" xmlns:w15="http://schemas.microsoft.com/office/word/2012/wordml" xmlns:w16cex="http://schemas.microsoft.com/office/word/2018/wordml/cex" xmlns:w16cid="http://schemas.microsoft.com/office/word/2016/wordml/cid" xmlns:w16="http://schemas.microsoft.com/office/word/2018/wordml" xmlns:w16sdtdh="http://schemas.microsoft.com/office/word/2020/wordml/sdtdatahash" xmlns:w16se="http://schemas.microsoft.com/office/word/2015/wordml/symex" xmlns:wpg="http://schemas.microsoft.com/office/word/2010/wordprocessingGroup" xmlns:wpi="http://schemas.microsoft.com/office/word/2010/wordprocessingInk" xmlns:wne="http://schemas.microsoft.com/office/word/2006/wordml" xmlns:wps="http://schemas.microsoft.com/office/word/2010/wordprocessingShape" mc:Ignorable="w14 w15 w16se w16cid w16 w16cex w16sdtdh wp14">
   <w:abstractNum w:abstractNumId="0" w15:restartNumberingAfterBreak="0">
     <w:nsid w:val="07835C12"/>
     <w:multiLevelType w:val="hybridMultilevel"/>
@@ -8573,71 +8598,71 @@
       </w:rPr>
     </w:lvl>
   </w:abstractNum>
-  <w:num w:numId="1" w16cid:durableId="1080759855">
+  <w:num w:numId="1">
     <w:abstractNumId w:val="16"/>
   </w:num>
-  <w:num w:numId="2" w16cid:durableId="1822036710">
+  <w:num w:numId="2">
     <w:abstractNumId w:val="12"/>
   </w:num>
-  <w:num w:numId="3" w16cid:durableId="852301442">
+  <w:num w:numId="3">
     <w:abstractNumId w:val="13"/>
   </w:num>
-  <w:num w:numId="4" w16cid:durableId="241374527">
+  <w:num w:numId="4">
     <w:abstractNumId w:val="4"/>
   </w:num>
-  <w:num w:numId="5" w16cid:durableId="1200586516">
+  <w:num w:numId="5">
     <w:abstractNumId w:val="14"/>
   </w:num>
-  <w:num w:numId="6" w16cid:durableId="1341619707">
+  <w:num w:numId="6">
     <w:abstractNumId w:val="14"/>
     <w:lvlOverride w:ilvl="0">
       <w:startOverride w:val="1"/>
     </w:lvlOverride>
   </w:num>
-  <w:num w:numId="7" w16cid:durableId="1287080251">
+  <w:num w:numId="7">
     <w:abstractNumId w:val="5"/>
   </w:num>
-  <w:num w:numId="8" w16cid:durableId="1751855127">
+  <w:num w:numId="8">
     <w:abstractNumId w:val="9"/>
   </w:num>
-  <w:num w:numId="9" w16cid:durableId="2131973155">
+  <w:num w:numId="9">
     <w:abstractNumId w:val="8"/>
   </w:num>
-  <w:num w:numId="10" w16cid:durableId="1101073057">
+  <w:num w:numId="10">
     <w:abstractNumId w:val="7"/>
   </w:num>
-  <w:num w:numId="11" w16cid:durableId="1028145471">
+  <w:num w:numId="11">
     <w:abstractNumId w:val="2"/>
   </w:num>
-  <w:num w:numId="12" w16cid:durableId="631599997">
+  <w:num w:numId="12">
     <w:abstractNumId w:val="1"/>
   </w:num>
-  <w:num w:numId="13" w16cid:durableId="1795707702">
+  <w:num w:numId="13">
     <w:abstractNumId w:val="15"/>
   </w:num>
-  <w:num w:numId="14" w16cid:durableId="686062492">
+  <w:num w:numId="14">
     <w:abstractNumId w:val="6"/>
   </w:num>
-  <w:num w:numId="15" w16cid:durableId="801462400">
+  <w:num w:numId="15">
     <w:abstractNumId w:val="0"/>
   </w:num>
-  <w:num w:numId="16" w16cid:durableId="513307894">
+  <w:num w:numId="16">
     <w:abstractNumId w:val="10"/>
   </w:num>
-  <w:num w:numId="17" w16cid:durableId="1633486212">
+  <w:num w:numId="17">
     <w:abstractNumId w:val="11"/>
   </w:num>
-  <w:num w:numId="18" w16cid:durableId="273249037">
+  <w:num w:numId="18">
     <w:abstractNumId w:val="3"/>
   </w:num>
-  <w:num w:numId="19" w16cid:durableId="1463962922">
+  <w:num w:numId="19">
     <w:abstractNumId w:val="16"/>
   </w:num>
 </w:numbering>
 </file>
 
 <file path=word/styles.xml><?xml version="1.0" encoding="utf-8"?>
-<w:styles xmlns:mc="http://schemas.openxmlformats.org/markup-compatibility/2006" xmlns:r="http://schemas.openxmlformats.org/officeDocument/2006/relationships" xmlns:w="http://schemas.openxmlformats.org/wordprocessingml/2006/main" xmlns:w14="http://schemas.microsoft.com/office/word/2010/wordml" xmlns:w15="http://schemas.microsoft.com/office/word/2012/wordml" xmlns:w16cex="http://schemas.microsoft.com/office/word/2018/wordml/cex" xmlns:w16cid="http://schemas.microsoft.com/office/word/2016/wordml/cid" xmlns:w16="http://schemas.microsoft.com/office/word/2018/wordml" xmlns:w16du="http://schemas.microsoft.com/office/word/2023/wordml/word16du" xmlns:w16sdtdh="http://schemas.microsoft.com/office/word/2020/wordml/sdtdatahash" xmlns:w16sdtfl="http://schemas.microsoft.com/office/word/2024/wordml/sdtformatlock" xmlns:w16se="http://schemas.microsoft.com/office/word/2015/wordml/symex" mc:Ignorable="w14 w15 w16se w16cid w16 w16cex w16sdtdh w16sdtfl w16du">
+<w:styles xmlns:mc="http://schemas.openxmlformats.org/markup-compatibility/2006" xmlns:r="http://schemas.openxmlformats.org/officeDocument/2006/relationships" xmlns:w="http://schemas.openxmlformats.org/wordprocessingml/2006/main" xmlns:w14="http://schemas.microsoft.com/office/word/2010/wordml" xmlns:w15="http://schemas.microsoft.com/office/word/2012/wordml" xmlns:w16cex="http://schemas.microsoft.com/office/word/2018/wordml/cex" xmlns:w16cid="http://schemas.microsoft.com/office/word/2016/wordml/cid" xmlns:w16="http://schemas.microsoft.com/office/word/2018/wordml" xmlns:w16sdtdh="http://schemas.microsoft.com/office/word/2020/wordml/sdtdatahash" xmlns:w16se="http://schemas.microsoft.com/office/word/2015/wordml/symex" mc:Ignorable="w14 w15 w16se w16cid w16 w16cex w16sdtdh">
   <w:docDefaults>
     <w:rPrDefault>
       <w:rPr>
@@ -9293,6 +9318,7 @@
   <w:style w:type="character" w:default="1" w:styleId="DefaultParagraphFont">
     <w:name w:val="Default Paragraph Font"/>
     <w:uiPriority w:val="1"/>
+    <w:semiHidden/>
     <w:unhideWhenUsed/>
   </w:style>
   <w:style w:type="table" w:default="1" w:styleId="TableNormal">

</xml_diff>